<commit_message>
It Prakties kwartaal 3
</commit_message>
<xml_diff>
--- a/RTT PAT 2025/Fase 1/Beplanningsdokument.docx
+++ b/RTT PAT 2025/Fase 1/Beplanningsdokument.docx
@@ -3613,7 +3613,7 @@
     <w:p>
       <w:r>
         <w:pict w14:anchorId="1DC427A7">
-          <v:rect id="_x0000_i1092" style="width:0;height:1.5pt" o:hralign="center" o:hrstd="t" o:hr="t" fillcolor="#a0a0a0" stroked="f"/>
+          <v:rect id="_x0000_i1025" style="width:0;height:1.5pt" o:hralign="center" o:hrstd="t" o:hr="t" fillcolor="#a0a0a0" stroked="f"/>
         </w:pict>
       </w:r>
     </w:p>
@@ -3987,7 +3987,7 @@
     <w:p>
       <w:r>
         <w:pict w14:anchorId="0931ED2B">
-          <v:rect id="_x0000_i1086" style="width:0;height:1.5pt" o:hralign="center" o:hrstd="t" o:hr="t" fillcolor="#a0a0a0" stroked="f"/>
+          <v:rect id="_x0000_i1026" style="width:0;height:1.5pt" o:hralign="center" o:hrstd="t" o:hr="t" fillcolor="#a0a0a0" stroked="f"/>
         </w:pict>
       </w:r>
     </w:p>
@@ -4405,7 +4405,7 @@
     <w:p>
       <w:r>
         <w:pict w14:anchorId="5B643747">
-          <v:rect id="_x0000_i1087" style="width:0;height:1.5pt" o:hralign="center" o:hrstd="t" o:hr="t" fillcolor="#a0a0a0" stroked="f"/>
+          <v:rect id="_x0000_i1027" style="width:0;height:1.5pt" o:hralign="center" o:hrstd="t" o:hr="t" fillcolor="#a0a0a0" stroked="f"/>
         </w:pict>
       </w:r>
     </w:p>
@@ -4805,7 +4805,7 @@
     <w:p>
       <w:r>
         <w:pict w14:anchorId="2EA98286">
-          <v:rect id="_x0000_i1088" style="width:0;height:1.5pt" o:hralign="center" o:hrstd="t" o:hr="t" fillcolor="#a0a0a0" stroked="f"/>
+          <v:rect id="_x0000_i1028" style="width:0;height:1.5pt" o:hralign="center" o:hrstd="t" o:hr="t" fillcolor="#a0a0a0" stroked="f"/>
         </w:pict>
       </w:r>
     </w:p>
@@ -5178,7 +5178,7 @@
     <w:p>
       <w:r>
         <w:pict w14:anchorId="38011F74">
-          <v:rect id="_x0000_i1089" style="width:0;height:1.5pt" o:hralign="center" o:hrstd="t" o:hr="t" fillcolor="#a0a0a0" stroked="f"/>
+          <v:rect id="_x0000_i1029" style="width:0;height:1.5pt" o:hralign="center" o:hrstd="t" o:hr="t" fillcolor="#a0a0a0" stroked="f"/>
         </w:pict>
       </w:r>
     </w:p>
@@ -5594,7 +5594,7 @@
     <w:p>
       <w:r>
         <w:pict w14:anchorId="1E2077A4">
-          <v:rect id="_x0000_i1090" style="width:0;height:1.5pt" o:hralign="center" o:hrstd="t" o:hr="t" fillcolor="#a0a0a0" stroked="f"/>
+          <v:rect id="_x0000_i1030" style="width:0;height:1.5pt" o:hralign="center" o:hrstd="t" o:hr="t" fillcolor="#a0a0a0" stroked="f"/>
         </w:pict>
       </w:r>
     </w:p>
@@ -5922,7 +5922,7 @@
     <w:p>
       <w:r>
         <w:pict w14:anchorId="5E9A8187">
-          <v:rect id="_x0000_i1091" style="width:0;height:1.5pt" o:hralign="center" o:hrstd="t" o:hr="t" fillcolor="#a0a0a0" stroked="f"/>
+          <v:rect id="_x0000_i1031" style="width:0;height:1.5pt" o:hralign="center" o:hrstd="t" o:hr="t" fillcolor="#a0a0a0" stroked="f"/>
         </w:pict>
       </w:r>
     </w:p>
@@ -8240,11 +8240,6 @@
     </w:tbl>
     <w:p>
       <w:pPr>
-        <w:pStyle w:val="Heading1"/>
-      </w:pPr>
-    </w:p>
-    <w:p>
-      <w:pPr>
         <w:rPr>
           <w:rFonts w:asciiTheme="majorHAnsi" w:eastAsiaTheme="majorEastAsia" w:hAnsiTheme="majorHAnsi" w:cstheme="majorBidi"/>
           <w:color w:val="2E74B5" w:themeColor="accent1" w:themeShade="BF"/>
@@ -8252,150 +8247,64 @@
           <w:szCs w:val="40"/>
         </w:rPr>
       </w:pPr>
+    </w:p>
+    <w:p/>
+    <w:p/>
+    <w:p/>
+    <w:p/>
+    <w:p/>
+    <w:p/>
+    <w:p/>
+    <w:p/>
+    <w:p/>
+    <w:p>
       <w:r>
         <w:br w:type="page"/>
       </w:r>
     </w:p>
     <w:p>
-      <w:pPr>
-        <w:pStyle w:val="Heading1"/>
-      </w:pPr>
-      <w:bookmarkStart w:id="16" w:name="_Toc207884884"/>
       <w:r>
         <w:lastRenderedPageBreak/>
-        <w:t>Bylae B</w:t>
-      </w:r>
-      <w:bookmarkEnd w:id="16"/>
+        <w:drawing>
+          <wp:inline distT="0" distB="0" distL="0" distR="0" wp14:anchorId="18DC0E07" wp14:editId="71A23353">
+            <wp:extent cx="6543040" cy="10506752"/>
+            <wp:effectExtent l="0" t="0" r="0" b="8890"/>
+            <wp:docPr id="1026625104" name="Picture 1"/>
+            <wp:cNvGraphicFramePr>
+              <a:graphicFrameLocks xmlns:a="http://schemas.openxmlformats.org/drawingml/2006/main" noChangeAspect="1"/>
+            </wp:cNvGraphicFramePr>
+            <a:graphic xmlns:a="http://schemas.openxmlformats.org/drawingml/2006/main">
+              <a:graphicData uri="http://schemas.openxmlformats.org/drawingml/2006/picture">
+                <pic:pic xmlns:pic="http://schemas.openxmlformats.org/drawingml/2006/picture">
+                  <pic:nvPicPr>
+                    <pic:cNvPr id="1026625104" name=""/>
+                    <pic:cNvPicPr/>
+                  </pic:nvPicPr>
+                  <pic:blipFill>
+                    <a:blip r:embed="rId26"/>
+                    <a:stretch>
+                      <a:fillRect/>
+                    </a:stretch>
+                  </pic:blipFill>
+                  <pic:spPr>
+                    <a:xfrm>
+                      <a:off x="0" y="0"/>
+                      <a:ext cx="6558361" cy="10531354"/>
+                    </a:xfrm>
+                    <a:prstGeom prst="rect">
+                      <a:avLst/>
+                    </a:prstGeom>
+                  </pic:spPr>
+                </pic:pic>
+              </a:graphicData>
+            </a:graphic>
+          </wp:inline>
+        </w:drawing>
+      </w:r>
     </w:p>
-    <w:p>
-      <w:r>
-        <w:t xml:space="preserve">Ek, </w:t>
-      </w:r>
-      <w:r>
-        <w:rPr>
-          <w:b/>
-          <w:bCs/>
-        </w:rPr>
-        <w:t>Pieter-Louis Schoeman</w:t>
-      </w:r>
-      <w:r>
-        <w:t xml:space="preserve">, </w:t>
-      </w:r>
-      <w:proofErr w:type="spellStart"/>
-      <w:r>
-        <w:t>verklaar</w:t>
-      </w:r>
-      <w:proofErr w:type="spellEnd"/>
-      <w:r>
-        <w:t xml:space="preserve"> </w:t>
-      </w:r>
-      <w:proofErr w:type="spellStart"/>
-      <w:r>
-        <w:t>dat</w:t>
-      </w:r>
-      <w:proofErr w:type="spellEnd"/>
-      <w:r>
-        <w:t xml:space="preserve"> </w:t>
-      </w:r>
-      <w:proofErr w:type="spellStart"/>
-      <w:r>
-        <w:t>hierdie</w:t>
-      </w:r>
-      <w:proofErr w:type="spellEnd"/>
-      <w:r>
-        <w:t xml:space="preserve"> </w:t>
-      </w:r>
-      <w:proofErr w:type="spellStart"/>
-      <w:r>
-        <w:t>werk</w:t>
-      </w:r>
-      <w:proofErr w:type="spellEnd"/>
-      <w:r>
-        <w:t xml:space="preserve"> my </w:t>
-      </w:r>
-      <w:proofErr w:type="spellStart"/>
-      <w:r>
-        <w:t>eie</w:t>
-      </w:r>
-      <w:proofErr w:type="spellEnd"/>
-      <w:r>
-        <w:t xml:space="preserve"> is. Ek het alle </w:t>
-      </w:r>
-      <w:proofErr w:type="spellStart"/>
-      <w:r>
-        <w:t>hulpbronne</w:t>
-      </w:r>
-      <w:proofErr w:type="spellEnd"/>
-      <w:r>
-        <w:t xml:space="preserve"> </w:t>
-      </w:r>
-      <w:proofErr w:type="spellStart"/>
-      <w:r>
-        <w:t>en</w:t>
-      </w:r>
-      <w:proofErr w:type="spellEnd"/>
-      <w:r>
-        <w:t xml:space="preserve"> </w:t>
-      </w:r>
-      <w:proofErr w:type="spellStart"/>
-      <w:r>
-        <w:t>hulp</w:t>
-      </w:r>
-      <w:proofErr w:type="spellEnd"/>
-      <w:r>
-        <w:t xml:space="preserve"> </w:t>
-      </w:r>
-      <w:proofErr w:type="spellStart"/>
-      <w:r>
-        <w:t>erken</w:t>
-      </w:r>
-      <w:proofErr w:type="spellEnd"/>
-      <w:r>
-        <w:t xml:space="preserve"> </w:t>
-      </w:r>
-      <w:proofErr w:type="spellStart"/>
-      <w:r>
-        <w:t>en</w:t>
-      </w:r>
-      <w:proofErr w:type="spellEnd"/>
-      <w:r>
-        <w:t xml:space="preserve"> </w:t>
-      </w:r>
-      <w:proofErr w:type="spellStart"/>
-      <w:r>
-        <w:t>geen</w:t>
-      </w:r>
-      <w:proofErr w:type="spellEnd"/>
-      <w:r>
-        <w:t xml:space="preserve"> </w:t>
-      </w:r>
-      <w:proofErr w:type="spellStart"/>
-      <w:r>
-        <w:t>plagiaat</w:t>
-      </w:r>
-      <w:proofErr w:type="spellEnd"/>
-      <w:r>
-        <w:t xml:space="preserve"> </w:t>
-      </w:r>
-      <w:proofErr w:type="spellStart"/>
-      <w:r>
-        <w:t>gepleeg</w:t>
-      </w:r>
-      <w:proofErr w:type="spellEnd"/>
-      <w:r>
-        <w:t xml:space="preserve"> </w:t>
-      </w:r>
-      <w:proofErr w:type="spellStart"/>
-      <w:r>
-        <w:t>nie</w:t>
-      </w:r>
-      <w:proofErr w:type="spellEnd"/>
-      <w:r>
-        <w:t>.</w:t>
-      </w:r>
-    </w:p>
+    <w:p/>
     <w:sectPr>
-      <w:footerReference w:type="default" r:id="rId26"/>
+      <w:footerReference w:type="default" r:id="rId27"/>
       <w:pgSz w:w="11906" w:h="16838"/>
       <w:pgMar w:top="1440" w:right="1440" w:bottom="1440" w:left="1440" w:header="708" w:footer="708" w:gutter="0"/>
       <w:pgNumType w:start="0"/>
@@ -17114,6 +17023,7 @@
     <w:rsid w:val="001E4C41"/>
     <w:rsid w:val="00203760"/>
     <w:rsid w:val="00297B8F"/>
+    <w:rsid w:val="0039684C"/>
     <w:rsid w:val="004534F3"/>
     <w:rsid w:val="004B0D3B"/>
     <w:rsid w:val="00941C59"/>

</xml_diff>